<commit_message>
docs: add concrete Saturday-Sunday timeline illustration to manual
</commit_message>
<xml_diff>
--- a/Ment-X_Mentee_Manual_v5.docx
+++ b/Ment-X_Mentee_Manual_v5.docx
@@ -383,7 +383,7 @@
           <w:color w:val="0D9488"/>
           <w:sz w:val="28"/>
         </w:rPr>
-        <w:t>4. Step-by-Step Task Lifecycle</w:t>
+        <w:t>4. Step-by-Step Task Lifecycle &amp; Deadline Example</w:t>
       </w:r>
     </w:p>
     <w:p>
@@ -464,6 +464,152 @@
           <w:sz w:val="20"/>
         </w:rPr>
         <w:t>When the deadline passes, submit your progress summary, completion percentage, and any challenges you faced. All updates are logged on the site.</w:t>
+      </w:r>
+    </w:p>
+    <w:p>
+      <w:pPr>
+        <w:spacing w:before="160" w:after="80"/>
+        <w:ind w:left="216"/>
+      </w:pPr>
+      <w:r>
+        <w:rPr>
+          <w:b/>
+          <w:color w:val="0F766E"/>
+        </w:rPr>
+        <w:t>📅 Timeline Example (Saturday Deadline &amp; Sunday Grace Period):</w:t>
+      </w:r>
+    </w:p>
+    <w:p>
+      <w:pPr>
+        <w:pStyle w:val="ListBullet"/>
+        <w:spacing w:after="60"/>
+        <w:ind w:left="504"/>
+      </w:pPr>
+      <w:r>
+        <w:rPr>
+          <w:b/>
+        </w:rPr>
+        <w:t xml:space="preserve">Wednesday 9:00 AM: </w:t>
+      </w:r>
+      <w:r>
+        <w:rPr>
+          <w:sz w:val="20"/>
+        </w:rPr>
+        <w:t>Mentor assigns a task to you. You immediately receive a task-assigned email and a push notification.</w:t>
+      </w:r>
+    </w:p>
+    <w:p>
+      <w:pPr>
+        <w:pStyle w:val="ListBullet"/>
+        <w:spacing w:after="60"/>
+        <w:ind w:left="504"/>
+      </w:pPr>
+      <w:r>
+        <w:rPr>
+          <w:b/>
+        </w:rPr>
+        <w:t xml:space="preserve">Wednesday - Saturday: </w:t>
+      </w:r>
+      <w:r>
+        <w:rPr>
+          <w:sz w:val="20"/>
+        </w:rPr>
+        <w:t>You work on the task. Once you view details, click 'Mark Read' and 'Start Work' to change status to 'IN_PROGRESS' (Important: This unlocks the submit button!).</w:t>
+      </w:r>
+    </w:p>
+    <w:p>
+      <w:pPr>
+        <w:pStyle w:val="ListBullet"/>
+        <w:spacing w:after="60"/>
+        <w:ind w:left="504"/>
+      </w:pPr>
+      <w:r>
+        <w:rPr>
+          <w:b/>
+        </w:rPr>
+        <w:t xml:space="preserve">Saturday 11:59 PM: </w:t>
+      </w:r>
+      <w:r>
+        <w:rPr>
+          <w:sz w:val="20"/>
+        </w:rPr>
+        <w:t>Official task deadline passes. The task is now officially overdue.</w:t>
+      </w:r>
+    </w:p>
+    <w:p>
+      <w:pPr>
+        <w:pStyle w:val="ListBullet"/>
+        <w:spacing w:after="60"/>
+        <w:ind w:left="504"/>
+      </w:pPr>
+      <w:r>
+        <w:rPr>
+          <w:b/>
+        </w:rPr>
+        <w:t xml:space="preserve">Sunday 11:15 AM: </w:t>
+      </w:r>
+      <w:r>
+        <w:rPr>
+          <w:sz w:val="20"/>
+        </w:rPr>
+        <w:t>If you haven't submitted your update yet, the scheduler sends you a morning reminder email and push notification.</w:t>
+      </w:r>
+    </w:p>
+    <w:p>
+      <w:pPr>
+        <w:pStyle w:val="ListBullet"/>
+        <w:spacing w:after="60"/>
+        <w:ind w:left="504"/>
+      </w:pPr>
+      <w:r>
+        <w:rPr>
+          <w:b/>
+        </w:rPr>
+        <w:t xml:space="preserve">Sunday 3:00 PM: </w:t>
+      </w:r>
+      <w:r>
+        <w:rPr>
+          <w:sz w:val="20"/>
+        </w:rPr>
+        <w:t>You submit your weekly update. The task is still in the 'Active Tasks' tab because of the 24-hour grace window.</w:t>
+      </w:r>
+    </w:p>
+    <w:p>
+      <w:pPr>
+        <w:pStyle w:val="ListBullet"/>
+        <w:spacing w:after="60"/>
+        <w:ind w:left="504"/>
+      </w:pPr>
+      <w:r>
+        <w:rPr>
+          <w:b/>
+        </w:rPr>
+        <w:t xml:space="preserve">Sunday 5:00 PM: </w:t>
+      </w:r>
+      <w:r>
+        <w:rPr>
+          <w:sz w:val="20"/>
+        </w:rPr>
+        <w:t>Scheduler runs evening check, but skips you because you successfully submitted at 3:00 PM.</w:t>
+      </w:r>
+    </w:p>
+    <w:p>
+      <w:pPr>
+        <w:pStyle w:val="ListBullet"/>
+        <w:spacing w:after="60"/>
+        <w:ind w:left="504"/>
+      </w:pPr>
+      <w:r>
+        <w:rPr>
+          <w:b/>
+        </w:rPr>
+        <w:t xml:space="preserve">Sunday 11:59 PM: </w:t>
+      </w:r>
+      <w:r>
+        <w:rPr>
+          <w:sz w:val="20"/>
+        </w:rPr>
+        <w:t>The 24-hour grace period window closes completely. The task is locked and moves to the 'Missed Tasks' tab.</w:t>
       </w:r>
     </w:p>
     <w:p>

</xml_diff>